<commit_message>
Spelling fixed: "batterie" -> "battery" and "level" -> "levels"
Change-Id: I37150541ea69ac1933674dc5781b9251df4d5ff3
</commit_message>
<xml_diff>
--- a/Documentation/SEDAP-Express ICD v1.4.5.docx
+++ b/Documentation/SEDAP-Express ICD v1.4.5.docx
@@ -35937,7 +35937,25 @@
           <w:szCs w:val="22"/>
           <w:lang w:val="en-US"/>
         </w:rPr>
-        <w:t>&lt;AmmunitionLevel&gt;</w:t>
+        <w:t>&lt;AmmunitionLevel</w:t>
+      </w:r>
+      <w:r>
+        <w:rPr>
+          <w:rFonts w:ascii="Roboto" w:hAnsi="Roboto" w:cs="Segoe UI"/>
+          <w:sz w:val="22"/>
+          <w:szCs w:val="22"/>
+          <w:lang w:val="en-US"/>
+        </w:rPr>
+        <w:t>s</w:t>
+      </w:r>
+      <w:r>
+        <w:rPr>
+          <w:rFonts w:ascii="Roboto" w:hAnsi="Roboto" w:cs="Segoe UI"/>
+          <w:sz w:val="22"/>
+          <w:szCs w:val="22"/>
+          <w:lang w:val="en-US"/>
+        </w:rPr>
+        <w:t>&gt;</w:t>
       </w:r>
       <w:r>
         <w:rPr>
@@ -35991,7 +36009,25 @@
           <w:szCs w:val="22"/>
           <w:lang w:val="en-US"/>
         </w:rPr>
-        <w:t>uelLevel&gt;</w:t>
+        <w:t>uelLevel</w:t>
+      </w:r>
+      <w:r>
+        <w:rPr>
+          <w:rFonts w:ascii="Roboto" w:hAnsi="Roboto" w:cs="Segoe UI"/>
+          <w:sz w:val="22"/>
+          <w:szCs w:val="22"/>
+          <w:lang w:val="en-US"/>
+        </w:rPr>
+        <w:t>s</w:t>
+      </w:r>
+      <w:r>
+        <w:rPr>
+          <w:rFonts w:ascii="Roboto" w:hAnsi="Roboto" w:cs="Segoe UI"/>
+          <w:sz w:val="22"/>
+          <w:szCs w:val="22"/>
+          <w:lang w:val="en-US"/>
+        </w:rPr>
+        <w:t>&gt;</w:t>
       </w:r>
       <w:r>
         <w:rPr>
@@ -36045,7 +36081,25 @@
           <w:szCs w:val="22"/>
           <w:lang w:val="en-US"/>
         </w:rPr>
-        <w:t>Level&gt;</w:t>
+        <w:t>Level</w:t>
+      </w:r>
+      <w:r>
+        <w:rPr>
+          <w:rFonts w:ascii="Roboto" w:hAnsi="Roboto" w:cs="Segoe UI"/>
+          <w:sz w:val="22"/>
+          <w:szCs w:val="22"/>
+          <w:lang w:val="en-US"/>
+        </w:rPr>
+        <w:t>s</w:t>
+      </w:r>
+      <w:r>
+        <w:rPr>
+          <w:rFonts w:ascii="Roboto" w:hAnsi="Roboto" w:cs="Segoe UI"/>
+          <w:sz w:val="22"/>
+          <w:szCs w:val="22"/>
+          <w:lang w:val="en-US"/>
+        </w:rPr>
+        <w:t>&gt;</w:t>
       </w:r>
       <w:r>
         <w:rPr>
@@ -36072,7 +36126,25 @@
           <w:szCs w:val="22"/>
           <w:lang w:val="en-US"/>
         </w:rPr>
-        <w:t>&lt;StorageLevel&gt;*;</w:t>
+        <w:t>&lt;StorageLevel</w:t>
+      </w:r>
+      <w:r>
+        <w:rPr>
+          <w:rFonts w:ascii="Roboto" w:hAnsi="Roboto" w:cs="Segoe UI"/>
+          <w:sz w:val="22"/>
+          <w:szCs w:val="22"/>
+          <w:lang w:val="en-US"/>
+        </w:rPr>
+        <w:t>s</w:t>
+      </w:r>
+      <w:r>
+        <w:rPr>
+          <w:rFonts w:ascii="Roboto" w:hAnsi="Roboto" w:cs="Segoe UI"/>
+          <w:sz w:val="22"/>
+          <w:szCs w:val="22"/>
+          <w:lang w:val="en-US"/>
+        </w:rPr>
+        <w:t>&gt;*;</w:t>
       </w:r>
       <w:r>
         <w:rPr>
@@ -36167,14 +36239,14 @@
         <w:tblLook w:val="04A0" w:firstRow="1" w:lastRow="0" w:firstColumn="1" w:lastColumn="0" w:noHBand="0" w:noVBand="1"/>
       </w:tblPr>
       <w:tblGrid>
-        <w:gridCol w:w="1985"/>
-        <w:gridCol w:w="1417"/>
+        <w:gridCol w:w="2127"/>
+        <w:gridCol w:w="1275"/>
         <w:gridCol w:w="9241"/>
       </w:tblGrid>
       <w:tr>
         <w:tc>
           <w:tcPr>
-            <w:tcW w:w="1985" w:type="dxa"/>
+            <w:tcW w:w="2127" w:type="dxa"/>
           </w:tcPr>
           <w:p>
             <w:pPr>
@@ -36228,7 +36300,7 @@
         </w:tc>
         <w:tc>
           <w:tcPr>
-            <w:tcW w:w="1417" w:type="dxa"/>
+            <w:tcW w:w="1275" w:type="dxa"/>
           </w:tcPr>
           <w:p>
             <w:pPr>
@@ -36281,23 +36353,23 @@
       <w:tr>
         <w:tc>
           <w:tcPr>
-            <w:tcW w:w="1985" w:type="dxa"/>
-          </w:tcPr>
-          <w:p>
-            <w:pPr>
-              <w:pStyle w:val="NurText"/>
-              <w:rPr>
-                <w:rFonts w:ascii="Roboto" w:hAnsi="Roboto" w:cs="Segoe UI"/>
-                <w:sz w:val="22"/>
-                <w:szCs w:val="22"/>
-                <w:lang w:val="en-US"/>
-              </w:rPr>
-            </w:pPr>
-          </w:p>
-        </w:tc>
-        <w:tc>
-          <w:tcPr>
-            <w:tcW w:w="1417" w:type="dxa"/>
+            <w:tcW w:w="2127" w:type="dxa"/>
+          </w:tcPr>
+          <w:p>
+            <w:pPr>
+              <w:pStyle w:val="NurText"/>
+              <w:rPr>
+                <w:rFonts w:ascii="Roboto" w:hAnsi="Roboto" w:cs="Segoe UI"/>
+                <w:sz w:val="22"/>
+                <w:szCs w:val="22"/>
+                <w:lang w:val="en-US"/>
+              </w:rPr>
+            </w:pPr>
+          </w:p>
+        </w:tc>
+        <w:tc>
+          <w:tcPr>
+            <w:tcW w:w="1275" w:type="dxa"/>
           </w:tcPr>
           <w:p>
             <w:pPr>
@@ -36350,23 +36422,23 @@
       <w:tr>
         <w:tc>
           <w:tcPr>
-            <w:tcW w:w="1985" w:type="dxa"/>
-          </w:tcPr>
-          <w:p>
-            <w:pPr>
-              <w:pStyle w:val="NurText"/>
-              <w:rPr>
-                <w:rFonts w:ascii="Roboto" w:hAnsi="Roboto" w:cs="Segoe UI"/>
-                <w:sz w:val="22"/>
-                <w:szCs w:val="22"/>
-                <w:lang w:val="en-US"/>
-              </w:rPr>
-            </w:pPr>
-          </w:p>
-        </w:tc>
-        <w:tc>
-          <w:tcPr>
-            <w:tcW w:w="1417" w:type="dxa"/>
+            <w:tcW w:w="2127" w:type="dxa"/>
+          </w:tcPr>
+          <w:p>
+            <w:pPr>
+              <w:pStyle w:val="NurText"/>
+              <w:rPr>
+                <w:rFonts w:ascii="Roboto" w:hAnsi="Roboto" w:cs="Segoe UI"/>
+                <w:sz w:val="22"/>
+                <w:szCs w:val="22"/>
+                <w:lang w:val="en-US"/>
+              </w:rPr>
+            </w:pPr>
+          </w:p>
+        </w:tc>
+        <w:tc>
+          <w:tcPr>
+            <w:tcW w:w="1275" w:type="dxa"/>
           </w:tcPr>
           <w:p>
             <w:pPr>
@@ -36419,23 +36491,23 @@
       <w:tr>
         <w:tc>
           <w:tcPr>
-            <w:tcW w:w="1985" w:type="dxa"/>
-          </w:tcPr>
-          <w:p>
-            <w:pPr>
-              <w:pStyle w:val="NurText"/>
-              <w:rPr>
-                <w:rFonts w:ascii="Roboto" w:hAnsi="Roboto" w:cs="Segoe UI"/>
-                <w:sz w:val="22"/>
-                <w:szCs w:val="22"/>
-                <w:lang w:val="en-US"/>
-              </w:rPr>
-            </w:pPr>
-          </w:p>
-        </w:tc>
-        <w:tc>
-          <w:tcPr>
-            <w:tcW w:w="1417" w:type="dxa"/>
+            <w:tcW w:w="2127" w:type="dxa"/>
+          </w:tcPr>
+          <w:p>
+            <w:pPr>
+              <w:pStyle w:val="NurText"/>
+              <w:rPr>
+                <w:rFonts w:ascii="Roboto" w:hAnsi="Roboto" w:cs="Segoe UI"/>
+                <w:sz w:val="22"/>
+                <w:szCs w:val="22"/>
+                <w:lang w:val="en-US"/>
+              </w:rPr>
+            </w:pPr>
+          </w:p>
+        </w:tc>
+        <w:tc>
+          <w:tcPr>
+            <w:tcW w:w="1275" w:type="dxa"/>
           </w:tcPr>
           <w:p>
             <w:pPr>
@@ -36497,23 +36569,23 @@
       <w:tr>
         <w:tc>
           <w:tcPr>
-            <w:tcW w:w="1985" w:type="dxa"/>
-          </w:tcPr>
-          <w:p>
-            <w:pPr>
-              <w:pStyle w:val="NurText"/>
-              <w:rPr>
-                <w:rFonts w:ascii="Roboto" w:hAnsi="Roboto" w:cs="Segoe UI"/>
-                <w:sz w:val="22"/>
-                <w:szCs w:val="22"/>
-                <w:lang w:val="en-US"/>
-              </w:rPr>
-            </w:pPr>
-          </w:p>
-        </w:tc>
-        <w:tc>
-          <w:tcPr>
-            <w:tcW w:w="1417" w:type="dxa"/>
+            <w:tcW w:w="2127" w:type="dxa"/>
+          </w:tcPr>
+          <w:p>
+            <w:pPr>
+              <w:pStyle w:val="NurText"/>
+              <w:rPr>
+                <w:rFonts w:ascii="Roboto" w:hAnsi="Roboto" w:cs="Segoe UI"/>
+                <w:sz w:val="22"/>
+                <w:szCs w:val="22"/>
+                <w:lang w:val="en-US"/>
+              </w:rPr>
+            </w:pPr>
+          </w:p>
+        </w:tc>
+        <w:tc>
+          <w:tcPr>
+            <w:tcW w:w="1275" w:type="dxa"/>
           </w:tcPr>
           <w:p>
             <w:pPr>
@@ -36566,7 +36638,7 @@
       <w:tr>
         <w:tc>
           <w:tcPr>
-            <w:tcW w:w="1985" w:type="dxa"/>
+            <w:tcW w:w="2127" w:type="dxa"/>
           </w:tcPr>
           <w:p>
             <w:pPr>
@@ -36620,7 +36692,7 @@
         </w:tc>
         <w:tc>
           <w:tcPr>
-            <w:tcW w:w="1417" w:type="dxa"/>
+            <w:tcW w:w="1275" w:type="dxa"/>
           </w:tcPr>
           <w:p>
             <w:pPr>
@@ -36673,23 +36745,23 @@
       <w:tr>
         <w:tc>
           <w:tcPr>
-            <w:tcW w:w="1985" w:type="dxa"/>
-          </w:tcPr>
-          <w:p>
-            <w:pPr>
-              <w:pStyle w:val="NurText"/>
-              <w:rPr>
-                <w:rFonts w:ascii="Roboto" w:hAnsi="Roboto" w:cs="Segoe UI"/>
-                <w:sz w:val="22"/>
-                <w:szCs w:val="22"/>
-                <w:lang w:val="en-US"/>
-              </w:rPr>
-            </w:pPr>
-          </w:p>
-        </w:tc>
-        <w:tc>
-          <w:tcPr>
-            <w:tcW w:w="1417" w:type="dxa"/>
+            <w:tcW w:w="2127" w:type="dxa"/>
+          </w:tcPr>
+          <w:p>
+            <w:pPr>
+              <w:pStyle w:val="NurText"/>
+              <w:rPr>
+                <w:rFonts w:ascii="Roboto" w:hAnsi="Roboto" w:cs="Segoe UI"/>
+                <w:sz w:val="22"/>
+                <w:szCs w:val="22"/>
+                <w:lang w:val="en-US"/>
+              </w:rPr>
+            </w:pPr>
+          </w:p>
+        </w:tc>
+        <w:tc>
+          <w:tcPr>
+            <w:tcW w:w="1275" w:type="dxa"/>
           </w:tcPr>
           <w:p>
             <w:pPr>
@@ -36742,23 +36814,23 @@
       <w:tr>
         <w:tc>
           <w:tcPr>
-            <w:tcW w:w="1985" w:type="dxa"/>
-          </w:tcPr>
-          <w:p>
-            <w:pPr>
-              <w:pStyle w:val="NurText"/>
-              <w:rPr>
-                <w:rFonts w:ascii="Roboto" w:hAnsi="Roboto" w:cs="Segoe UI"/>
-                <w:sz w:val="22"/>
-                <w:szCs w:val="22"/>
-                <w:lang w:val="en-US"/>
-              </w:rPr>
-            </w:pPr>
-          </w:p>
-        </w:tc>
-        <w:tc>
-          <w:tcPr>
-            <w:tcW w:w="1417" w:type="dxa"/>
+            <w:tcW w:w="2127" w:type="dxa"/>
+          </w:tcPr>
+          <w:p>
+            <w:pPr>
+              <w:pStyle w:val="NurText"/>
+              <w:rPr>
+                <w:rFonts w:ascii="Roboto" w:hAnsi="Roboto" w:cs="Segoe UI"/>
+                <w:sz w:val="22"/>
+                <w:szCs w:val="22"/>
+                <w:lang w:val="en-US"/>
+              </w:rPr>
+            </w:pPr>
+          </w:p>
+        </w:tc>
+        <w:tc>
+          <w:tcPr>
+            <w:tcW w:w="1275" w:type="dxa"/>
           </w:tcPr>
           <w:p>
             <w:pPr>
@@ -36820,23 +36892,23 @@
       <w:tr>
         <w:tc>
           <w:tcPr>
-            <w:tcW w:w="1985" w:type="dxa"/>
-          </w:tcPr>
-          <w:p>
-            <w:pPr>
-              <w:pStyle w:val="NurText"/>
-              <w:rPr>
-                <w:rFonts w:ascii="Roboto" w:hAnsi="Roboto" w:cs="Segoe UI"/>
-                <w:sz w:val="22"/>
-                <w:szCs w:val="22"/>
-                <w:lang w:val="en-US"/>
-              </w:rPr>
-            </w:pPr>
-          </w:p>
-        </w:tc>
-        <w:tc>
-          <w:tcPr>
-            <w:tcW w:w="1417" w:type="dxa"/>
+            <w:tcW w:w="2127" w:type="dxa"/>
+          </w:tcPr>
+          <w:p>
+            <w:pPr>
+              <w:pStyle w:val="NurText"/>
+              <w:rPr>
+                <w:rFonts w:ascii="Roboto" w:hAnsi="Roboto" w:cs="Segoe UI"/>
+                <w:sz w:val="22"/>
+                <w:szCs w:val="22"/>
+                <w:lang w:val="en-US"/>
+              </w:rPr>
+            </w:pPr>
+          </w:p>
+        </w:tc>
+        <w:tc>
+          <w:tcPr>
+            <w:tcW w:w="1275" w:type="dxa"/>
           </w:tcPr>
           <w:p>
             <w:pPr>
@@ -36916,23 +36988,23 @@
       <w:tr>
         <w:tc>
           <w:tcPr>
-            <w:tcW w:w="1985" w:type="dxa"/>
-          </w:tcPr>
-          <w:p>
-            <w:pPr>
-              <w:pStyle w:val="NurText"/>
-              <w:rPr>
-                <w:rFonts w:ascii="Roboto" w:hAnsi="Roboto" w:cs="Segoe UI"/>
-                <w:sz w:val="22"/>
-                <w:szCs w:val="22"/>
-                <w:lang w:val="en-US"/>
-              </w:rPr>
-            </w:pPr>
-          </w:p>
-        </w:tc>
-        <w:tc>
-          <w:tcPr>
-            <w:tcW w:w="1417" w:type="dxa"/>
+            <w:tcW w:w="2127" w:type="dxa"/>
+          </w:tcPr>
+          <w:p>
+            <w:pPr>
+              <w:pStyle w:val="NurText"/>
+              <w:rPr>
+                <w:rFonts w:ascii="Roboto" w:hAnsi="Roboto" w:cs="Segoe UI"/>
+                <w:sz w:val="22"/>
+                <w:szCs w:val="22"/>
+                <w:lang w:val="en-US"/>
+              </w:rPr>
+            </w:pPr>
+          </w:p>
+        </w:tc>
+        <w:tc>
+          <w:tcPr>
+            <w:tcW w:w="1275" w:type="dxa"/>
           </w:tcPr>
           <w:p>
             <w:pPr>
@@ -37003,7 +37075,7 @@
       <w:tr>
         <w:tc>
           <w:tcPr>
-            <w:tcW w:w="1985" w:type="dxa"/>
+            <w:tcW w:w="2127" w:type="dxa"/>
           </w:tcPr>
           <w:p>
             <w:pPr>
@@ -37025,12 +37097,21 @@
               </w:rPr>
               <w:t>AmmunitionLevel</w:t>
             </w:r>
+            <w:r>
+              <w:rPr>
+                <w:rFonts w:ascii="Roboto" w:hAnsi="Roboto" w:cs="Segoe UI"/>
+                <w:sz w:val="22"/>
+                <w:szCs w:val="22"/>
+                <w:lang w:val="en-US"/>
+              </w:rPr>
+              <w:t>s</w:t>
+            </w:r>
             <w:proofErr w:type="spellEnd"/>
           </w:p>
         </w:tc>
         <w:tc>
           <w:tcPr>
-            <w:tcW w:w="1417" w:type="dxa"/>
+            <w:tcW w:w="1275" w:type="dxa"/>
           </w:tcPr>
           <w:p>
             <w:pPr>
@@ -37101,7 +37182,7 @@
       <w:tr>
         <w:tc>
           <w:tcPr>
-            <w:tcW w:w="1985" w:type="dxa"/>
+            <w:tcW w:w="2127" w:type="dxa"/>
           </w:tcPr>
           <w:p>
             <w:pPr>
@@ -37132,12 +37213,21 @@
               </w:rPr>
               <w:t>uelLevel</w:t>
             </w:r>
+            <w:r>
+              <w:rPr>
+                <w:rFonts w:ascii="Roboto" w:hAnsi="Roboto" w:cs="Segoe UI"/>
+                <w:sz w:val="22"/>
+                <w:szCs w:val="22"/>
+                <w:lang w:val="en-US"/>
+              </w:rPr>
+              <w:t>s</w:t>
+            </w:r>
             <w:proofErr w:type="spellEnd"/>
           </w:p>
         </w:tc>
         <w:tc>
           <w:tcPr>
-            <w:tcW w:w="1417" w:type="dxa"/>
+            <w:tcW w:w="1275" w:type="dxa"/>
           </w:tcPr>
           <w:p>
             <w:pPr>
@@ -37208,7 +37298,7 @@
       <w:tr>
         <w:tc>
           <w:tcPr>
-            <w:tcW w:w="1985" w:type="dxa"/>
+            <w:tcW w:w="2127" w:type="dxa"/>
           </w:tcPr>
           <w:p>
             <w:pPr>
@@ -37257,12 +37347,21 @@
               </w:rPr>
               <w:t>Level</w:t>
             </w:r>
+            <w:r>
+              <w:rPr>
+                <w:rFonts w:ascii="Roboto" w:hAnsi="Roboto" w:cs="Segoe UI"/>
+                <w:sz w:val="22"/>
+                <w:szCs w:val="22"/>
+                <w:lang w:val="en-US"/>
+              </w:rPr>
+              <w:t>s</w:t>
+            </w:r>
             <w:proofErr w:type="spellEnd"/>
           </w:p>
         </w:tc>
         <w:tc>
           <w:tcPr>
-            <w:tcW w:w="1417" w:type="dxa"/>
+            <w:tcW w:w="1275" w:type="dxa"/>
           </w:tcPr>
           <w:p>
             <w:pPr>
@@ -37387,7 +37486,7 @@
       <w:tr>
         <w:tc>
           <w:tcPr>
-            <w:tcW w:w="1985" w:type="dxa"/>
+            <w:tcW w:w="2127" w:type="dxa"/>
           </w:tcPr>
           <w:p>
             <w:pPr>
@@ -37409,12 +37508,21 @@
               </w:rPr>
               <w:t>StorageLevel</w:t>
             </w:r>
+            <w:r>
+              <w:rPr>
+                <w:rFonts w:ascii="Roboto" w:hAnsi="Roboto" w:cs="Segoe UI"/>
+                <w:sz w:val="22"/>
+                <w:szCs w:val="22"/>
+                <w:lang w:val="en-US"/>
+              </w:rPr>
+              <w:t>s</w:t>
+            </w:r>
             <w:proofErr w:type="spellEnd"/>
           </w:p>
         </w:tc>
         <w:tc>
           <w:tcPr>
-            <w:tcW w:w="1417" w:type="dxa"/>
+            <w:tcW w:w="1275" w:type="dxa"/>
           </w:tcPr>
           <w:p>
             <w:pPr>
@@ -37494,7 +37602,7 @@
       <w:tr>
         <w:tc>
           <w:tcPr>
-            <w:tcW w:w="1985" w:type="dxa"/>
+            <w:tcW w:w="2127" w:type="dxa"/>
           </w:tcPr>
           <w:p>
             <w:pPr>
@@ -37521,7 +37629,7 @@
         </w:tc>
         <w:tc>
           <w:tcPr>
-            <w:tcW w:w="1417" w:type="dxa"/>
+            <w:tcW w:w="1275" w:type="dxa"/>
           </w:tcPr>
           <w:p>
             <w:pPr>
@@ -37648,7 +37756,7 @@
       <w:tr>
         <w:tc>
           <w:tcPr>
-            <w:tcW w:w="1985" w:type="dxa"/>
+            <w:tcW w:w="2127" w:type="dxa"/>
           </w:tcPr>
           <w:p>
             <w:pPr>
@@ -37675,7 +37783,7 @@
         </w:tc>
         <w:tc>
           <w:tcPr>
-            <w:tcW w:w="1417" w:type="dxa"/>
+            <w:tcW w:w="1275" w:type="dxa"/>
           </w:tcPr>
           <w:p>
             <w:pPr>
@@ -37728,23 +37836,23 @@
       <w:tr>
         <w:tc>
           <w:tcPr>
-            <w:tcW w:w="1985" w:type="dxa"/>
-          </w:tcPr>
-          <w:p>
-            <w:pPr>
-              <w:pStyle w:val="NurText"/>
-              <w:rPr>
-                <w:rFonts w:ascii="Roboto" w:hAnsi="Roboto" w:cs="Segoe UI"/>
-                <w:sz w:val="22"/>
-                <w:szCs w:val="22"/>
-                <w:lang w:val="en-US"/>
-              </w:rPr>
-            </w:pPr>
-          </w:p>
-        </w:tc>
-        <w:tc>
-          <w:tcPr>
-            <w:tcW w:w="1417" w:type="dxa"/>
+            <w:tcW w:w="2127" w:type="dxa"/>
+          </w:tcPr>
+          <w:p>
+            <w:pPr>
+              <w:pStyle w:val="NurText"/>
+              <w:rPr>
+                <w:rFonts w:ascii="Roboto" w:hAnsi="Roboto" w:cs="Segoe UI"/>
+                <w:sz w:val="22"/>
+                <w:szCs w:val="22"/>
+                <w:lang w:val="en-US"/>
+              </w:rPr>
+            </w:pPr>
+          </w:p>
+        </w:tc>
+        <w:tc>
+          <w:tcPr>
+            <w:tcW w:w="1275" w:type="dxa"/>
           </w:tcPr>
           <w:p>
             <w:pPr>
@@ -37797,23 +37905,23 @@
       <w:tr>
         <w:tc>
           <w:tcPr>
-            <w:tcW w:w="1985" w:type="dxa"/>
-          </w:tcPr>
-          <w:p>
-            <w:pPr>
-              <w:pStyle w:val="NurText"/>
-              <w:rPr>
-                <w:rFonts w:ascii="Roboto" w:hAnsi="Roboto" w:cs="Segoe UI"/>
-                <w:sz w:val="22"/>
-                <w:szCs w:val="22"/>
-                <w:lang w:val="en-US"/>
-              </w:rPr>
-            </w:pPr>
-          </w:p>
-        </w:tc>
-        <w:tc>
-          <w:tcPr>
-            <w:tcW w:w="1417" w:type="dxa"/>
+            <w:tcW w:w="2127" w:type="dxa"/>
+          </w:tcPr>
+          <w:p>
+            <w:pPr>
+              <w:pStyle w:val="NurText"/>
+              <w:rPr>
+                <w:rFonts w:ascii="Roboto" w:hAnsi="Roboto" w:cs="Segoe UI"/>
+                <w:sz w:val="22"/>
+                <w:szCs w:val="22"/>
+                <w:lang w:val="en-US"/>
+              </w:rPr>
+            </w:pPr>
+          </w:p>
+        </w:tc>
+        <w:tc>
+          <w:tcPr>
+            <w:tcW w:w="1275" w:type="dxa"/>
           </w:tcPr>
           <w:p>
             <w:pPr>
@@ -37893,23 +38001,23 @@
       <w:tr>
         <w:tc>
           <w:tcPr>
-            <w:tcW w:w="1985" w:type="dxa"/>
-          </w:tcPr>
-          <w:p>
-            <w:pPr>
-              <w:pStyle w:val="NurText"/>
-              <w:rPr>
-                <w:rFonts w:ascii="Roboto" w:hAnsi="Roboto" w:cs="Segoe UI"/>
-                <w:sz w:val="22"/>
-                <w:szCs w:val="22"/>
-                <w:lang w:val="en-US"/>
-              </w:rPr>
-            </w:pPr>
-          </w:p>
-        </w:tc>
-        <w:tc>
-          <w:tcPr>
-            <w:tcW w:w="1417" w:type="dxa"/>
+            <w:tcW w:w="2127" w:type="dxa"/>
+          </w:tcPr>
+          <w:p>
+            <w:pPr>
+              <w:pStyle w:val="NurText"/>
+              <w:rPr>
+                <w:rFonts w:ascii="Roboto" w:hAnsi="Roboto" w:cs="Segoe UI"/>
+                <w:sz w:val="22"/>
+                <w:szCs w:val="22"/>
+                <w:lang w:val="en-US"/>
+              </w:rPr>
+            </w:pPr>
+          </w:p>
+        </w:tc>
+        <w:tc>
+          <w:tcPr>
+            <w:tcW w:w="1275" w:type="dxa"/>
           </w:tcPr>
           <w:p>
             <w:pPr>
@@ -37989,23 +38097,23 @@
       <w:tr>
         <w:tc>
           <w:tcPr>
-            <w:tcW w:w="1985" w:type="dxa"/>
-          </w:tcPr>
-          <w:p>
-            <w:pPr>
-              <w:pStyle w:val="NurText"/>
-              <w:rPr>
-                <w:rFonts w:ascii="Roboto" w:hAnsi="Roboto" w:cs="Segoe UI"/>
-                <w:sz w:val="22"/>
-                <w:szCs w:val="22"/>
-                <w:lang w:val="en-US"/>
-              </w:rPr>
-            </w:pPr>
-          </w:p>
-        </w:tc>
-        <w:tc>
-          <w:tcPr>
-            <w:tcW w:w="1417" w:type="dxa"/>
+            <w:tcW w:w="2127" w:type="dxa"/>
+          </w:tcPr>
+          <w:p>
+            <w:pPr>
+              <w:pStyle w:val="NurText"/>
+              <w:rPr>
+                <w:rFonts w:ascii="Roboto" w:hAnsi="Roboto" w:cs="Segoe UI"/>
+                <w:sz w:val="22"/>
+                <w:szCs w:val="22"/>
+                <w:lang w:val="en-US"/>
+              </w:rPr>
+            </w:pPr>
+          </w:p>
+        </w:tc>
+        <w:tc>
+          <w:tcPr>
+            <w:tcW w:w="1275" w:type="dxa"/>
           </w:tcPr>
           <w:p>
             <w:pPr>
@@ -38076,23 +38184,23 @@
       <w:tr>
         <w:tc>
           <w:tcPr>
-            <w:tcW w:w="1985" w:type="dxa"/>
-          </w:tcPr>
-          <w:p>
-            <w:pPr>
-              <w:pStyle w:val="NurText"/>
-              <w:rPr>
-                <w:rFonts w:ascii="Roboto" w:hAnsi="Roboto" w:cs="Segoe UI"/>
-                <w:sz w:val="22"/>
-                <w:szCs w:val="22"/>
-                <w:lang w:val="en-US"/>
-              </w:rPr>
-            </w:pPr>
-          </w:p>
-        </w:tc>
-        <w:tc>
-          <w:tcPr>
-            <w:tcW w:w="1417" w:type="dxa"/>
+            <w:tcW w:w="2127" w:type="dxa"/>
+          </w:tcPr>
+          <w:p>
+            <w:pPr>
+              <w:pStyle w:val="NurText"/>
+              <w:rPr>
+                <w:rFonts w:ascii="Roboto" w:hAnsi="Roboto" w:cs="Segoe UI"/>
+                <w:sz w:val="22"/>
+                <w:szCs w:val="22"/>
+                <w:lang w:val="en-US"/>
+              </w:rPr>
+            </w:pPr>
+          </w:p>
+        </w:tc>
+        <w:tc>
+          <w:tcPr>
+            <w:tcW w:w="1275" w:type="dxa"/>
           </w:tcPr>
           <w:p>
             <w:pPr>
@@ -38190,7 +38298,7 @@
       <w:tr>
         <w:tc>
           <w:tcPr>
-            <w:tcW w:w="1985" w:type="dxa"/>
+            <w:tcW w:w="2127" w:type="dxa"/>
           </w:tcPr>
           <w:p>
             <w:pPr>
@@ -38215,7 +38323,7 @@
         </w:tc>
         <w:tc>
           <w:tcPr>
-            <w:tcW w:w="1417" w:type="dxa"/>
+            <w:tcW w:w="1275" w:type="dxa"/>
           </w:tcPr>
           <w:p>
             <w:pPr>
@@ -38277,7 +38385,7 @@
       <w:tr>
         <w:tc>
           <w:tcPr>
-            <w:tcW w:w="1985" w:type="dxa"/>
+            <w:tcW w:w="2127" w:type="dxa"/>
           </w:tcPr>
           <w:p>
             <w:pPr>
@@ -38302,7 +38410,7 @@
         </w:tc>
         <w:tc>
           <w:tcPr>
-            <w:tcW w:w="1417" w:type="dxa"/>
+            <w:tcW w:w="1275" w:type="dxa"/>
           </w:tcPr>
           <w:p>
             <w:pPr>
@@ -38364,7 +38472,7 @@
       <w:tr>
         <w:tc>
           <w:tcPr>
-            <w:tcW w:w="1985" w:type="dxa"/>
+            <w:tcW w:w="2127" w:type="dxa"/>
           </w:tcPr>
           <w:p>
             <w:pPr>
@@ -38390,7 +38498,7 @@
         </w:tc>
         <w:tc>
           <w:tcPr>
-            <w:tcW w:w="1417" w:type="dxa"/>
+            <w:tcW w:w="1275" w:type="dxa"/>
           </w:tcPr>
           <w:p>
             <w:pPr>
@@ -43010,10 +43118,10 @@
             <v:path o:extrusionok="f" gradientshapeok="t" o:connecttype="rect"/>
             <o:lock v:ext="edit" aspectratio="t"/>
           </v:shapetype>
-          <v:shape id="_x0000_i1025" type="#_x0000_t75" style="width:376.45pt;height:228.85pt" o:ole="">
+          <v:shape id="_x0000_i1025" type="#_x0000_t75" style="width:376.3pt;height:228.85pt" o:ole="">
             <v:imagedata r:id="rId12" o:title=""/>
           </v:shape>
-          <o:OLEObject Type="Embed" ProgID="Visio.Drawing.15" ShapeID="_x0000_i1025" DrawAspect="Content" ObjectID="_1849773798" r:id="rId13"/>
+          <o:OLEObject Type="Embed" ProgID="Visio.Drawing.15" ShapeID="_x0000_i1025" DrawAspect="Content" ObjectID="_1849774358" r:id="rId13"/>
         </w:object>
       </w:r>
     </w:p>
@@ -46184,10 +46292,10 @@
           <w:rFonts w:ascii="Roboto" w:hAnsi="Roboto"/>
         </w:rPr>
         <w:object w:dxaOrig="15986" w:dyaOrig="10955" w14:anchorId="6B9B38B9">
-          <v:shape id="_x0000_i1026" type="#_x0000_t75" style="width:608.2pt;height:416.75pt" o:ole="">
+          <v:shape id="_x0000_i1026" type="#_x0000_t75" style="width:608.15pt;height:417pt" o:ole="">
             <v:imagedata r:id="rId15" o:title=""/>
           </v:shape>
-          <o:OLEObject Type="Embed" ProgID="Visio.Drawing.15" ShapeID="_x0000_i1026" DrawAspect="Content" ObjectID="_1849773799" r:id="rId16"/>
+          <o:OLEObject Type="Embed" ProgID="Visio.Drawing.15" ShapeID="_x0000_i1026" DrawAspect="Content" ObjectID="_1849774359" r:id="rId16"/>
         </w:object>
       </w:r>
     </w:p>

</xml_diff>